<commit_message>
fix(ios): sync CocoaPods Podfile.lock with shared_preferences; update Twinora_Privacy_Policy.docx & txt
</commit_message>
<xml_diff>
--- a/store_legal_documents/Twinora_Privacy_Policy.docx
+++ b/store_legal_documents/Twinora_Privacy_Policy.docx
@@ -420,13 +420,7 @@
         <w:spacing w:before="280" w:after="120"/>
       </w:pPr>
       <w:r>
-        <w:rPr>
-          <w:rFonts w:ascii="Arial" w:hAnsi="Arial"/>
-          <w:b/>
-          <w:color w:val="0E192D"/>
-          <w:sz w:val="36"/>
-        </w:rPr>
-        <w:t>4. Third-Party AI API Providers</w:t>
+        <w:t>4. Third-Party AI API Providers &amp; In-App Consent (Apple Guidelines 5.1.1 &amp; 5.1.2)</w:t>
       </w:r>
     </w:p>
     <w:p>
@@ -434,12 +428,7 @@
         <w:spacing w:after="120" w:line="276" w:lineRule="auto"/>
       </w:pPr>
       <w:r>
-        <w:rPr>
-          <w:rFonts w:ascii="Arial" w:hAnsi="Arial"/>
-          <w:color w:val="323232"/>
-          <w:sz w:val="21"/>
-        </w:rPr>
-        <w:t>To execute specialized creation workflows, Twinora securely interfaces via encrypted API requests with industry-leading cloud AI providers bound by strict contractual data protection agreements:</w:t>
+        <w:t>To execute specialized creation workflows, Twinora securely interfaces via encrypted API requests with industry-leading cloud AI providers. User consent is explicitly collected in-app prior to transmitting any user media (photos, video clips, and audio recordings). Media transmission occurs strictly and exclusively on-demand when you actively initiate an image or video generation, never in the background. All third-party partners are bound by confidentiality and data protection agreements providing equal protection to this policy:</w:t>
       </w:r>
     </w:p>
     <w:p>
@@ -448,21 +437,7 @@
         <w:spacing w:after="80" w:line="276" w:lineRule="auto"/>
       </w:pPr>
       <w:r>
-        <w:rPr>
-          <w:rFonts w:ascii="Arial" w:hAnsi="Arial"/>
-          <w:b/>
-          <w:color w:val="1E1E1E"/>
-          <w:sz w:val="21"/>
-        </w:rPr>
-        <w:t xml:space="preserve">Google Gemini API (Google Cloud Platform): </w:t>
-      </w:r>
-      <w:r>
-        <w:rPr>
-          <w:rFonts w:ascii="Arial" w:hAnsi="Arial"/>
-          <w:color w:val="323232"/>
-          <w:sz w:val="21"/>
-        </w:rPr>
-        <w:t>Used for high-resolution AI image rendering and reference image consistency processing.</w:t>
+        <w:t>Google Gemini API (Google Cloud Platform): Used for high-resolution AI image rendering and reference image consistency processing.</w:t>
       </w:r>
     </w:p>
     <w:p>
@@ -471,21 +446,7 @@
         <w:spacing w:after="80" w:line="276" w:lineRule="auto"/>
       </w:pPr>
       <w:r>
-        <w:rPr>
-          <w:rFonts w:ascii="Arial" w:hAnsi="Arial"/>
-          <w:b/>
-          <w:color w:val="1E1E1E"/>
-          <w:sz w:val="21"/>
-        </w:rPr>
-        <w:t xml:space="preserve">OpenAI API (GPT-4o Vision): </w:t>
-      </w:r>
-      <w:r>
-        <w:rPr>
-          <w:rFonts w:ascii="Arial" w:hAnsi="Arial"/>
-          <w:color w:val="323232"/>
-          <w:sz w:val="21"/>
-        </w:rPr>
-        <w:t>Used for template layout vision analysis and prompt intelligence optimization.</w:t>
+        <w:t>Fal.ai / Kling 3.0 Engine: Used for high-definition B-roll motion rendering and cinematic video story creation.</w:t>
       </w:r>
     </w:p>
     <w:p>
@@ -494,21 +455,7 @@
         <w:spacing w:after="80" w:line="276" w:lineRule="auto"/>
       </w:pPr>
       <w:r>
-        <w:rPr>
-          <w:rFonts w:ascii="Arial" w:hAnsi="Arial"/>
-          <w:b/>
-          <w:color w:val="1E1E1E"/>
-          <w:sz w:val="21"/>
-        </w:rPr>
-        <w:t xml:space="preserve">Fal.ai / Kling 3.0 Engine: </w:t>
-      </w:r>
-      <w:r>
-        <w:rPr>
-          <w:rFonts w:ascii="Arial" w:hAnsi="Arial"/>
-          <w:color w:val="323232"/>
-          <w:sz w:val="21"/>
-        </w:rPr>
-        <w:t>Used for high-definition B-roll motion rendering and cinematic video story creation.</w:t>
+        <w:t>Everypixel Labs &amp; Sync.so Engine: Used for high-fidelity facial lip-syncing, audio alignment, and audio-visual synchronization.</w:t>
       </w:r>
     </w:p>
     <w:p>
@@ -517,21 +464,7 @@
         <w:spacing w:after="80" w:line="276" w:lineRule="auto"/>
       </w:pPr>
       <w:r>
-        <w:rPr>
-          <w:rFonts w:ascii="Arial" w:hAnsi="Arial"/>
-          <w:b/>
-          <w:color w:val="1E1E1E"/>
-          <w:sz w:val="21"/>
-        </w:rPr>
-        <w:t xml:space="preserve">HeyGen API: </w:t>
-      </w:r>
-      <w:r>
-        <w:rPr>
-          <w:rFonts w:ascii="Arial" w:hAnsi="Arial"/>
-          <w:color w:val="323232"/>
-          <w:sz w:val="21"/>
-        </w:rPr>
-        <w:t>Used for Direct Talk avatar video generation.</w:t>
+        <w:t>HeyGen API: Used for talking head avatar video creation and dynamic facial motion generation.</w:t>
       </w:r>
     </w:p>
     <w:p>
@@ -540,21 +473,7 @@
         <w:spacing w:after="80" w:line="276" w:lineRule="auto"/>
       </w:pPr>
       <w:r>
-        <w:rPr>
-          <w:rFonts w:ascii="Arial" w:hAnsi="Arial"/>
-          <w:b/>
-          <w:color w:val="1E1E1E"/>
-          <w:sz w:val="21"/>
-        </w:rPr>
-        <w:t xml:space="preserve">Sync.so Engine: </w:t>
-      </w:r>
-      <w:r>
-        <w:rPr>
-          <w:rFonts w:ascii="Arial" w:hAnsi="Arial"/>
-          <w:color w:val="323232"/>
-          <w:sz w:val="21"/>
-        </w:rPr>
-        <w:t>Used for high-fidelity facial lip-syncing and audio alignment.</w:t>
+        <w:t>OpenAI API (GPT-4o Vision): Used for template layout vision analysis and prompt intelligence optimization.</w:t>
       </w:r>
     </w:p>
     <w:p>

</xml_diff>

<commit_message>
chore: update website URL to twinora.ai and update official privacy policy Google Docs URL
</commit_message>
<xml_diff>
--- a/store_legal_documents/Twinora_Privacy_Policy.docx
+++ b/store_legal_documents/Twinora_Privacy_Policy.docx
@@ -804,18 +804,13 @@
         <w:spacing w:after="120" w:line="276" w:lineRule="auto"/>
       </w:pPr>
       <w:r>
-        <w:rPr>
-          <w:rFonts w:ascii="Arial" w:hAnsi="Arial"/>
-          <w:color w:val="323232"/>
-          <w:sz w:val="21"/>
-        </w:rPr>
         <w:t>Digital Passive Academy LTD</w:t>
         <w:br/>
         <w:t>Attention: Data Protection Officer / Privacy Legal Team</w:t>
         <w:br/>
         <w:t>Email: support@twinora.com</w:t>
         <w:br/>
-        <w:t>Website: https://twinora.com</w:t>
+        <w:t>Website: https://twinora.ai</w:t>
       </w:r>
     </w:p>
     <w:sectPr>

</xml_diff>